<commit_message>
Move Backyard Market & Brews from Thursday to Sunday, add Moonlight Market special
Thursday's 4pm-dusk market moves to Sunday noon-4pm starting Aug 30 (days
getting dark too early); the last Thursday occurrence (Aug 27) runs as a
one-off "Moonlight Market" special. Seasonal Packers Sundays football framing
now folds into the Sunday market instead of running as a separate event, and
the retired "Moonlight Brews" monthly event is removed. Updates recurring
events data, the /sunday command, the brand skill references, and the
matching playbook sheets/PDFs. Also adds the finished Moonlight Market poster
graphic.
</commit_message>
<xml_diff>
--- a/playbook/editable/3-EVERY-DAY.docx
+++ b/playbook/editable/3-EVERY-DAY.docx
@@ -385,40 +385,6 @@
               <w:rPr>
                 <w:b/>
               </w:rPr>
-              <w:t>Market &amp; Brews</w:t>
-            </w:r>
-            <w:r>
-              <w:t xml:space="preserve"> (Thu)</w:t>
-            </w:r>
-          </w:p>
-        </w:tc>
-        <w:tc>
-          <w:tcPr>
-            <w:tcW w:type="dxa" w:w="2880"/>
-          </w:tcPr>
-          <w:p>
-            <w:r>
-              <w:t>Local vendor and maker groups, small business, craft fair and farmers market, community events</w:t>
-            </w:r>
-          </w:p>
-        </w:tc>
-        <w:tc>
-          <w:tcPr>
-            <w:tcW w:type="dxa" w:w="2880"/>
-          </w:tcPr>
-          <w:p/>
-        </w:tc>
-      </w:tr>
-      <w:tr>
-        <w:tc>
-          <w:tcPr>
-            <w:tcW w:type="dxa" w:w="2880"/>
-          </w:tcPr>
-          <w:p>
-            <w:r>
-              <w:rPr>
-                <w:b/>
-              </w:rPr>
               <w:t>Karaoke</w:t>
             </w:r>
             <w:r>
@@ -467,6 +433,40 @@
           <w:p>
             <w:r>
               <w:t>Billiards and bar sports, nightlife, community</w:t>
+            </w:r>
+          </w:p>
+        </w:tc>
+        <w:tc>
+          <w:tcPr>
+            <w:tcW w:type="dxa" w:w="2880"/>
+          </w:tcPr>
+          <w:p/>
+        </w:tc>
+      </w:tr>
+      <w:tr>
+        <w:tc>
+          <w:tcPr>
+            <w:tcW w:type="dxa" w:w="2880"/>
+          </w:tcPr>
+          <w:p>
+            <w:r>
+              <w:rPr>
+                <w:b/>
+              </w:rPr>
+              <w:t>Market &amp; Brews</w:t>
+            </w:r>
+            <w:r>
+              <w:t xml:space="preserve"> (Sun)</w:t>
+            </w:r>
+          </w:p>
+        </w:tc>
+        <w:tc>
+          <w:tcPr>
+            <w:tcW w:type="dxa" w:w="2880"/>
+          </w:tcPr>
+          <w:p>
+            <w:r>
+              <w:t>Local vendor and maker groups, small business, craft fair and farmers market, community events</w:t>
             </w:r>
           </w:p>
         </w:tc>
@@ -696,7 +696,7 @@
         <w:t>Never fewer than 2 a day. Past that, more is always better.</w:t>
       </w:r>
       <w:r>
-        <w:t xml:space="preserve"> There is no upper limit and no such thing as too many. On a big event night, a packed Thursday market, live music, a tournament, shoot everything and post it all. Those are the nights that pull new people in.</w:t>
+        <w:t xml:space="preserve"> There is no upper limit and no such thing as too many. On a big event night, a packed Sunday market, live music, a tournament, shoot everything and post it all. Those are the nights that pull new people in.</w:t>
       </w:r>
     </w:p>
     <w:p>

</xml_diff>